<commit_message>
Add assignment and update conditionals
</commit_message>
<xml_diff>
--- a/Conditionals.docx
+++ b/Conditionals.docx
@@ -819,6 +819,7 @@
         <w:rPr>
           <w:b/>
           <w:bCs/>
+          <w:noProof/>
           <w:u w:val="single"/>
         </w:rPr>
         <w:drawing>
@@ -1163,6 +1164,275 @@
                     <a:xfrm>
                       <a:off x="0" y="0"/>
                       <a:ext cx="4467860" cy="5657850"/>
+                    </a:xfrm>
+                    <a:prstGeom prst="rect">
+                      <a:avLst/>
+                    </a:prstGeom>
+                    <a:noFill/>
+                    <a:ln>
+                      <a:noFill/>
+                    </a:ln>
+                  </pic:spPr>
+                </pic:pic>
+              </a:graphicData>
+            </a:graphic>
+          </wp:inline>
+        </w:drawing>
+      </w:r>
+    </w:p>
+    <w:p>
+      <w:pPr>
+        <w:rPr>
+          <w:b/>
+          <w:bCs/>
+          <w:u w:val="single"/>
+        </w:rPr>
+      </w:pPr>
+    </w:p>
+    <w:p>
+      <w:pPr>
+        <w:rPr>
+          <w:b/>
+          <w:bCs/>
+          <w:u w:val="single"/>
+        </w:rPr>
+      </w:pPr>
+      <w:r>
+        <w:rPr>
+          <w:noProof/>
+        </w:rPr>
+        <w:drawing>
+          <wp:inline distT="0" distB="0" distL="0" distR="0" wp14:anchorId="39A73110" wp14:editId="063D3418">
+            <wp:extent cx="5943600" cy="2628168"/>
+            <wp:effectExtent l="0" t="0" r="0" b="1270"/>
+            <wp:docPr id="1010132963" name="Picture 1"/>
+            <wp:cNvGraphicFramePr>
+              <a:graphicFrameLocks xmlns:a="http://schemas.openxmlformats.org/drawingml/2006/main" noChangeAspect="1"/>
+            </wp:cNvGraphicFramePr>
+            <a:graphic xmlns:a="http://schemas.openxmlformats.org/drawingml/2006/main">
+              <a:graphicData uri="http://schemas.openxmlformats.org/drawingml/2006/picture">
+                <pic:pic xmlns:pic="http://schemas.openxmlformats.org/drawingml/2006/picture">
+                  <pic:nvPicPr>
+                    <pic:cNvPr id="0" name="Picture 1"/>
+                    <pic:cNvPicPr>
+                      <a:picLocks noChangeAspect="1" noChangeArrowheads="1"/>
+                    </pic:cNvPicPr>
+                  </pic:nvPicPr>
+                  <pic:blipFill>
+                    <a:blip r:embed="rId20">
+                      <a:extLst>
+                        <a:ext uri="{28A0092B-C50C-407E-A947-70E740481C1C}">
+                          <a14:useLocalDpi xmlns:a14="http://schemas.microsoft.com/office/drawing/2010/main" val="0"/>
+                        </a:ext>
+                      </a:extLst>
+                    </a:blip>
+                    <a:srcRect/>
+                    <a:stretch>
+                      <a:fillRect/>
+                    </a:stretch>
+                  </pic:blipFill>
+                  <pic:spPr bwMode="auto">
+                    <a:xfrm>
+                      <a:off x="0" y="0"/>
+                      <a:ext cx="5943600" cy="2628168"/>
+                    </a:xfrm>
+                    <a:prstGeom prst="rect">
+                      <a:avLst/>
+                    </a:prstGeom>
+                    <a:noFill/>
+                    <a:ln>
+                      <a:noFill/>
+                    </a:ln>
+                  </pic:spPr>
+                </pic:pic>
+              </a:graphicData>
+            </a:graphic>
+          </wp:inline>
+        </w:drawing>
+      </w:r>
+    </w:p>
+    <w:p>
+      <w:pPr>
+        <w:rPr>
+          <w:b/>
+          <w:bCs/>
+          <w:u w:val="single"/>
+        </w:rPr>
+      </w:pPr>
+    </w:p>
+    <w:p>
+      <w:pPr>
+        <w:rPr>
+          <w:b/>
+          <w:bCs/>
+          <w:u w:val="single"/>
+        </w:rPr>
+      </w:pPr>
+      <w:r>
+        <w:rPr>
+          <w:noProof/>
+        </w:rPr>
+        <w:drawing>
+          <wp:inline distT="0" distB="0" distL="0" distR="0" wp14:anchorId="0C69114B" wp14:editId="35C9230B">
+            <wp:extent cx="5938520" cy="5013325"/>
+            <wp:effectExtent l="0" t="0" r="5080" b="0"/>
+            <wp:docPr id="1654386632" name="Picture 2"/>
+            <wp:cNvGraphicFramePr>
+              <a:graphicFrameLocks xmlns:a="http://schemas.openxmlformats.org/drawingml/2006/main" noChangeAspect="1"/>
+            </wp:cNvGraphicFramePr>
+            <a:graphic xmlns:a="http://schemas.openxmlformats.org/drawingml/2006/main">
+              <a:graphicData uri="http://schemas.openxmlformats.org/drawingml/2006/picture">
+                <pic:pic xmlns:pic="http://schemas.openxmlformats.org/drawingml/2006/picture">
+                  <pic:nvPicPr>
+                    <pic:cNvPr id="0" name="Picture 2"/>
+                    <pic:cNvPicPr>
+                      <a:picLocks noChangeAspect="1" noChangeArrowheads="1"/>
+                    </pic:cNvPicPr>
+                  </pic:nvPicPr>
+                  <pic:blipFill>
+                    <a:blip r:embed="rId21">
+                      <a:extLst>
+                        <a:ext uri="{28A0092B-C50C-407E-A947-70E740481C1C}">
+                          <a14:useLocalDpi xmlns:a14="http://schemas.microsoft.com/office/drawing/2010/main" val="0"/>
+                        </a:ext>
+                      </a:extLst>
+                    </a:blip>
+                    <a:srcRect/>
+                    <a:stretch>
+                      <a:fillRect/>
+                    </a:stretch>
+                  </pic:blipFill>
+                  <pic:spPr bwMode="auto">
+                    <a:xfrm>
+                      <a:off x="0" y="0"/>
+                      <a:ext cx="5938520" cy="5013325"/>
+                    </a:xfrm>
+                    <a:prstGeom prst="rect">
+                      <a:avLst/>
+                    </a:prstGeom>
+                    <a:noFill/>
+                    <a:ln>
+                      <a:noFill/>
+                    </a:ln>
+                  </pic:spPr>
+                </pic:pic>
+              </a:graphicData>
+            </a:graphic>
+          </wp:inline>
+        </w:drawing>
+      </w:r>
+    </w:p>
+    <w:p>
+      <w:pPr>
+        <w:rPr>
+          <w:b/>
+          <w:bCs/>
+          <w:u w:val="single"/>
+        </w:rPr>
+      </w:pPr>
+      <w:r>
+        <w:rPr>
+          <w:noProof/>
+        </w:rPr>
+        <w:drawing>
+          <wp:inline distT="0" distB="0" distL="0" distR="0" wp14:anchorId="154E9DDB" wp14:editId="040A990E">
+            <wp:extent cx="5938520" cy="6274435"/>
+            <wp:effectExtent l="0" t="0" r="5080" b="0"/>
+            <wp:docPr id="25739119" name="Picture 3"/>
+            <wp:cNvGraphicFramePr>
+              <a:graphicFrameLocks xmlns:a="http://schemas.openxmlformats.org/drawingml/2006/main" noChangeAspect="1"/>
+            </wp:cNvGraphicFramePr>
+            <a:graphic xmlns:a="http://schemas.openxmlformats.org/drawingml/2006/main">
+              <a:graphicData uri="http://schemas.openxmlformats.org/drawingml/2006/picture">
+                <pic:pic xmlns:pic="http://schemas.openxmlformats.org/drawingml/2006/picture">
+                  <pic:nvPicPr>
+                    <pic:cNvPr id="0" name="Picture 3"/>
+                    <pic:cNvPicPr>
+                      <a:picLocks noChangeAspect="1" noChangeArrowheads="1"/>
+                    </pic:cNvPicPr>
+                  </pic:nvPicPr>
+                  <pic:blipFill>
+                    <a:blip r:embed="rId22">
+                      <a:extLst>
+                        <a:ext uri="{28A0092B-C50C-407E-A947-70E740481C1C}">
+                          <a14:useLocalDpi xmlns:a14="http://schemas.microsoft.com/office/drawing/2010/main" val="0"/>
+                        </a:ext>
+                      </a:extLst>
+                    </a:blip>
+                    <a:srcRect/>
+                    <a:stretch>
+                      <a:fillRect/>
+                    </a:stretch>
+                  </pic:blipFill>
+                  <pic:spPr bwMode="auto">
+                    <a:xfrm>
+                      <a:off x="0" y="0"/>
+                      <a:ext cx="5938520" cy="6274435"/>
+                    </a:xfrm>
+                    <a:prstGeom prst="rect">
+                      <a:avLst/>
+                    </a:prstGeom>
+                    <a:noFill/>
+                    <a:ln>
+                      <a:noFill/>
+                    </a:ln>
+                  </pic:spPr>
+                </pic:pic>
+              </a:graphicData>
+            </a:graphic>
+          </wp:inline>
+        </w:drawing>
+      </w:r>
+    </w:p>
+    <w:p>
+      <w:pPr>
+        <w:rPr>
+          <w:b/>
+          <w:bCs/>
+          <w:u w:val="single"/>
+        </w:rPr>
+      </w:pPr>
+      <w:r>
+        <w:rPr>
+          <w:b/>
+          <w:bCs/>
+          <w:noProof/>
+          <w:u w:val="single"/>
+        </w:rPr>
+        <w:drawing>
+          <wp:inline distT="0" distB="0" distL="0" distR="0" wp14:anchorId="6E0FD593" wp14:editId="1EB37100">
+            <wp:extent cx="5938520" cy="2449195"/>
+            <wp:effectExtent l="0" t="0" r="5080" b="8255"/>
+            <wp:docPr id="42996295" name="Picture 1"/>
+            <wp:cNvGraphicFramePr>
+              <a:graphicFrameLocks xmlns:a="http://schemas.openxmlformats.org/drawingml/2006/main" noChangeAspect="1"/>
+            </wp:cNvGraphicFramePr>
+            <a:graphic xmlns:a="http://schemas.openxmlformats.org/drawingml/2006/main">
+              <a:graphicData uri="http://schemas.openxmlformats.org/drawingml/2006/picture">
+                <pic:pic xmlns:pic="http://schemas.openxmlformats.org/drawingml/2006/picture">
+                  <pic:nvPicPr>
+                    <pic:cNvPr id="0" name="Picture 1"/>
+                    <pic:cNvPicPr>
+                      <a:picLocks noChangeAspect="1" noChangeArrowheads="1"/>
+                    </pic:cNvPicPr>
+                  </pic:nvPicPr>
+                  <pic:blipFill>
+                    <a:blip r:embed="rId23">
+                      <a:extLst>
+                        <a:ext uri="{28A0092B-C50C-407E-A947-70E740481C1C}">
+                          <a14:useLocalDpi xmlns:a14="http://schemas.microsoft.com/office/drawing/2010/main" val="0"/>
+                        </a:ext>
+                      </a:extLst>
+                    </a:blip>
+                    <a:srcRect/>
+                    <a:stretch>
+                      <a:fillRect/>
+                    </a:stretch>
+                  </pic:blipFill>
+                  <pic:spPr bwMode="auto">
+                    <a:xfrm>
+                      <a:off x="0" y="0"/>
+                      <a:ext cx="5938520" cy="2449195"/>
                     </a:xfrm>
                     <a:prstGeom prst="rect">
                       <a:avLst/>

</xml_diff>